<commit_message>
Add EEE supervisor to proposal and fix CNG supervisor title
Co-Authored-By: Claude Opus 5.5 <noreply@anthropic.com>
Claude-Session: https://claude.ai/code/session_01Aby7mP2cTS2zzHAde1NLYk
</commit_message>
<xml_diff>
--- a/docs/proposal/ESC-491-Proposal-2026-10-01.docx
+++ b/docs/proposal/ESC-491-Proposal-2026-10-01.docx
@@ -783,7 +783,7 @@
                 <w:szCs w:val="24"/>
                 <w:lang w:val="en-US"/>
               </w:rPr>
-              <w:t>To be determined (EEE)</w:t>
+              <w:t>Muhammad Sohail (EEE)</w:t>
             </w:r>
           </w:p>
         </w:tc>
@@ -1763,7 +1763,7 @@
                 <w:szCs w:val="24"/>
                 <w:lang w:val="en-US"/>
               </w:rPr>
-              <w:t>CNG students will be supervised by Dr. Meryem Erbilek; the EEE supervisor will be determined.</w:t>
+              <w:t>CNG students will be supervised by Asst. Prof. Dr. Meryem Erbilek and the EEE student by Dr. Muhammad Sohail.</w:t>
             </w:r>
           </w:p>
           <w:p>

</xml_diff>